<commit_message>
Pack 48.2: TBank template v2 - fix field names + adaptive passport block
</commit_message>
<xml_diff>
--- a/templates/docx/bank_statement_template_044525974.docx
+++ b/templates/docx/bank_statement_template_044525974.docx
@@ -255,6 +255,14 @@
     </w:p>
     <w:p>
       <w:pPr>
+        <w:spacing w:before="0" w:after="0" w:line="200" w:lineRule="auto"/>
+      </w:pPr>
+      <w:r>
+        <w:t>{%p if applicant.nationality == "RUS" %}</w:t>
+      </w:r>
+    </w:p>
+    <w:p>
+      <w:pPr>
         <w:spacing w:before="120" w:after="120" w:line="280" w:lineRule="auto"/>
         <w:pBdr>
           <w:bottom w:val="single" w:sz="4" w:space="1" w:color="E5E5E5"/>
@@ -276,7 +284,57 @@
           <w:color w:val="030303"/>
           <w:sz w:val="18"/>
         </w:rPr>
-        <w:t>{{ applicant.address_living_full }}</w:t>
+        <w:t>{{ applicant.home_address }}</w:t>
+      </w:r>
+    </w:p>
+    <w:p>
+      <w:pPr>
+        <w:spacing w:before="0" w:after="0" w:line="200" w:lineRule="auto"/>
+      </w:pPr>
+      <w:r>
+        <w:t>{%p else %}</w:t>
+      </w:r>
+    </w:p>
+    <w:p>
+      <w:pPr>
+        <w:spacing w:before="120" w:after="120" w:line="280" w:lineRule="auto"/>
+        <w:pBdr>
+          <w:bottom w:val="single" w:sz="4" w:space="1" w:color="E5E5E5"/>
+        </w:pBdr>
+      </w:pPr>
+      <w:r>
+        <w:rPr>
+          <w:rFonts w:ascii="Arial" w:hAnsi="Arial" w:cs="Arial"/>
+          <w:b/>
+          <w:color w:val="030303"/>
+          <w:sz w:val="18"/>
+        </w:rPr>
+        <w:t xml:space="preserve">Адрес: </w:t>
+      </w:r>
+      <w:r>
+        <w:rPr>
+          <w:rFonts w:ascii="Arial" w:hAnsi="Arial" w:cs="Arial"/>
+          <w:b w:val="0"/>
+          <w:color w:val="030303"/>
+          <w:sz w:val="18"/>
+        </w:rPr>
+        <w:t>{{ applicant.home_address }}</w:t>
+      </w:r>
+    </w:p>
+    <w:p>
+      <w:pPr>
+        <w:spacing w:before="0" w:after="0" w:line="200" w:lineRule="auto"/>
+      </w:pPr>
+      <w:r>
+        <w:t>{%p endif %}</w:t>
+      </w:r>
+    </w:p>
+    <w:p>
+      <w:pPr>
+        <w:spacing w:before="0" w:after="0" w:line="200" w:lineRule="auto"/>
+      </w:pPr>
+      <w:r>
+        <w:t>{%p if applicant.nationality == "RUS" %}</w:t>
       </w:r>
     </w:p>
     <w:tbl>
@@ -330,7 +388,7 @@
                 <w:color w:val="030303"/>
                 <w:sz w:val="18"/>
               </w:rPr>
-              <w:t>{{ applicant.passport_series }}</w:t>
+              <w:t>{{ passport_series }}</w:t>
             </w:r>
           </w:p>
         </w:tc>
@@ -398,7 +456,7 @@
                 <w:color w:val="030303"/>
                 <w:sz w:val="18"/>
               </w:rPr>
-              <w:t>{{ applicant.passport_issue_date_formatted }}</w:t>
+              <w:t>{{ passport_issue_date_str }}</w:t>
             </w:r>
           </w:p>
         </w:tc>
@@ -440,6 +498,66 @@
     </w:tbl>
     <w:p>
       <w:pPr>
+        <w:spacing w:before="0" w:after="0" w:line="200" w:lineRule="auto"/>
+      </w:pPr>
+      <w:r>
+        <w:t>{%p else %}</w:t>
+      </w:r>
+    </w:p>
+    <w:p>
+      <w:pPr>
+        <w:spacing w:before="120" w:after="120" w:line="280" w:lineRule="auto"/>
+        <w:pBdr>
+          <w:bottom w:val="single" w:sz="4" w:space="1" w:color="E5E5E5"/>
+        </w:pBdr>
+      </w:pPr>
+      <w:r>
+        <w:rPr>
+          <w:rFonts w:ascii="Arial" w:hAnsi="Arial" w:cs="Arial"/>
+          <w:b/>
+          <w:color w:val="030303"/>
+          <w:sz w:val="18"/>
+        </w:rPr>
+        <w:t xml:space="preserve">Номер паспорта: </w:t>
+      </w:r>
+      <w:r>
+        <w:rPr>
+          <w:rFonts w:ascii="Arial" w:hAnsi="Arial" w:cs="Arial"/>
+          <w:b w:val="0"/>
+          <w:color w:val="030303"/>
+          <w:sz w:val="18"/>
+        </w:rPr>
+        <w:t>{{ applicant.passport_number }}</w:t>
+      </w:r>
+      <w:r>
+        <w:rPr>
+          <w:rFonts w:ascii="Arial" w:hAnsi="Arial" w:cs="Arial"/>
+          <w:b/>
+          <w:color w:val="030303"/>
+          <w:sz w:val="18"/>
+        </w:rPr>
+        <w:t xml:space="preserve">        Дата выдачи: </w:t>
+      </w:r>
+      <w:r>
+        <w:rPr>
+          <w:rFonts w:ascii="Arial" w:hAnsi="Arial" w:cs="Arial"/>
+          <w:b w:val="0"/>
+          <w:color w:val="030303"/>
+          <w:sz w:val="18"/>
+        </w:rPr>
+        <w:t>{{ passport_issue_date_str }}</w:t>
+      </w:r>
+    </w:p>
+    <w:p>
+      <w:pPr>
+        <w:spacing w:before="0" w:after="0" w:line="200" w:lineRule="auto"/>
+      </w:pPr>
+      <w:r>
+        <w:t>{%p endif %}</w:t>
+      </w:r>
+    </w:p>
+    <w:p>
+      <w:pPr>
         <w:spacing w:before="120" w:after="120" w:line="280" w:lineRule="auto"/>
         <w:pBdr>
           <w:bottom w:val="single" w:sz="4" w:space="1" w:color="E5E5E5"/>
@@ -461,7 +579,15 @@
           <w:color w:val="030303"/>
           <w:sz w:val="18"/>
         </w:rPr>
-        <w:t>{{ applicant.passport_issuer }}</w:t>
+        <w:t>{{ passport_issuer }}</w:t>
+      </w:r>
+    </w:p>
+    <w:p>
+      <w:pPr>
+        <w:spacing w:before="0" w:after="0" w:line="200" w:lineRule="auto"/>
+      </w:pPr>
+      <w:r>
+        <w:t>{%p if applicant.nationality == "RUS" %}</w:t>
       </w:r>
     </w:p>
     <w:p>
@@ -487,7 +613,15 @@
           <w:color w:val="030303"/>
           <w:sz w:val="18"/>
         </w:rPr>
-        <w:t>{{ applicant.address_registered_full }}</w:t>
+        <w:t>{{ applicant.home_address }}</w:t>
+      </w:r>
+    </w:p>
+    <w:p>
+      <w:pPr>
+        <w:spacing w:before="0" w:after="0" w:line="200" w:lineRule="auto"/>
+      </w:pPr>
+      <w:r>
+        <w:t>{%p endif %}</w:t>
       </w:r>
     </w:p>
     <w:p>

</xml_diff>

<commit_message>
Pack 48.2.1: fix 4 placeholder field names in TBank template
</commit_message>
<xml_diff>
--- a/templates/docx/bank_statement_template_044525974.docx
+++ b/templates/docx/bank_statement_template_044525974.docx
@@ -199,7 +199,7 @@
                 <w:color w:val="030303"/>
                 <w:sz w:val="18"/>
               </w:rPr>
-              <w:t>{{ bank.outgoing_number }}</w:t>
+              <w:t>{{ application.outgoing_number }}</w:t>
             </w:r>
           </w:p>
         </w:tc>
@@ -258,7 +258,7 @@
         <w:spacing w:before="0" w:after="0" w:line="200" w:lineRule="auto"/>
       </w:pPr>
       <w:r>
-        <w:t>{%p if applicant.nationality == "RUS" %}</w:t>
+        <w:t>{%p if applicant.nationality == 'RUS' %}</w:t>
       </w:r>
     </w:p>
     <w:p>
@@ -334,7 +334,7 @@
         <w:spacing w:before="0" w:after="0" w:line="200" w:lineRule="auto"/>
       </w:pPr>
       <w:r>
-        <w:t>{%p if applicant.nationality == "RUS" %}</w:t>
+        <w:t>{%p if applicant.nationality == 'RUS' %}</w:t>
       </w:r>
     </w:p>
     <w:tbl>
@@ -388,7 +388,7 @@
                 <w:color w:val="030303"/>
                 <w:sz w:val="18"/>
               </w:rPr>
-              <w:t>{{ passport_series }}</w:t>
+              <w:t>{{ applicant.passport_series }}</w:t>
             </w:r>
           </w:p>
         </w:tc>
@@ -456,7 +456,7 @@
                 <w:color w:val="030303"/>
                 <w:sz w:val="18"/>
               </w:rPr>
-              <w:t>{{ passport_issue_date_str }}</w:t>
+              <w:t>{{ applicant.passport_issue_date_str }}</w:t>
             </w:r>
           </w:p>
         </w:tc>
@@ -545,7 +545,7 @@
           <w:color w:val="030303"/>
           <w:sz w:val="18"/>
         </w:rPr>
-        <w:t>{{ passport_issue_date_str }}</w:t>
+        <w:t>{{ applicant.passport_issue_date_str }}</w:t>
       </w:r>
     </w:p>
     <w:p>
@@ -579,7 +579,7 @@
           <w:color w:val="030303"/>
           <w:sz w:val="18"/>
         </w:rPr>
-        <w:t>{{ passport_issuer }}</w:t>
+        <w:t>{{ applicant.passport_issuer }}</w:t>
       </w:r>
     </w:p>
     <w:p>
@@ -587,7 +587,7 @@
         <w:spacing w:before="0" w:after="0" w:line="200" w:lineRule="auto"/>
       </w:pPr>
       <w:r>
-        <w:t>{%p if applicant.nationality == "RUS" %}</w:t>
+        <w:t>{%p if applicant.nationality == 'RUS' %}</w:t>
       </w:r>
     </w:p>
     <w:p>

</xml_diff>

<commit_message>
Pack 48.3.0: bold lines between TBank tx rows
</commit_message>
<xml_diff>
--- a/templates/docx/bank_statement_template_044525974.docx
+++ b/templates/docx/bank_statement_template_044525974.docx
@@ -799,7 +799,7 @@
               <w:right w:w="80" w:type="dxa"/>
             </w:tcMar>
             <w:tcBorders>
-              <w:bottom w:val="single" w:sz="4" w:space="0" w:color="E5E5E5"/>
+              <w:bottom w:val="single" w:sz="8" w:space="0" w:color="909090"/>
             </w:tcBorders>
           </w:tcPr>
           <w:p>
@@ -841,7 +841,7 @@
               <w:right w:w="80" w:type="dxa"/>
             </w:tcMar>
             <w:tcBorders>
-              <w:bottom w:val="single" w:sz="4" w:space="0" w:color="E5E5E5"/>
+              <w:bottom w:val="single" w:sz="8" w:space="0" w:color="909090"/>
             </w:tcBorders>
           </w:tcPr>
           <w:p>
@@ -883,7 +883,7 @@
               <w:right w:w="80" w:type="dxa"/>
             </w:tcMar>
             <w:tcBorders>
-              <w:bottom w:val="single" w:sz="4" w:space="0" w:color="E5E5E5"/>
+              <w:bottom w:val="single" w:sz="8" w:space="0" w:color="909090"/>
             </w:tcBorders>
           </w:tcPr>
           <w:p>
@@ -925,7 +925,7 @@
               <w:right w:w="80" w:type="dxa"/>
             </w:tcMar>
             <w:tcBorders>
-              <w:bottom w:val="single" w:sz="4" w:space="0" w:color="E5E5E5"/>
+              <w:bottom w:val="single" w:sz="8" w:space="0" w:color="909090"/>
             </w:tcBorders>
           </w:tcPr>
           <w:p>
@@ -967,7 +967,7 @@
               <w:right w:w="80" w:type="dxa"/>
             </w:tcMar>
             <w:tcBorders>
-              <w:bottom w:val="single" w:sz="4" w:space="0" w:color="E5E5E5"/>
+              <w:bottom w:val="single" w:sz="8" w:space="0" w:color="909090"/>
             </w:tcBorders>
           </w:tcPr>
           <w:p>
@@ -1009,7 +1009,7 @@
               <w:right w:w="80" w:type="dxa"/>
             </w:tcMar>
             <w:tcBorders>
-              <w:bottom w:val="single" w:sz="4" w:space="0" w:color="E5E5E5"/>
+              <w:bottom w:val="single" w:sz="8" w:space="0" w:color="909090"/>
             </w:tcBorders>
           </w:tcPr>
           <w:p>
@@ -1053,7 +1053,7 @@
               <w:right w:w="80" w:type="dxa"/>
             </w:tcMar>
             <w:tcBorders>
-              <w:bottom w:val="single" w:sz="4" w:space="0" w:color="E5E5E5"/>
+              <w:bottom w:val="single" w:sz="8" w:space="0" w:color="909090"/>
             </w:tcBorders>
           </w:tcPr>
           <w:p>
@@ -1081,7 +1081,7 @@
               <w:right w:w="80" w:type="dxa"/>
             </w:tcMar>
             <w:tcBorders>
-              <w:bottom w:val="single" w:sz="4" w:space="0" w:color="E5E5E5"/>
+              <w:bottom w:val="single" w:sz="8" w:space="0" w:color="909090"/>
             </w:tcBorders>
           </w:tcPr>
           <w:p>
@@ -1109,7 +1109,7 @@
               <w:right w:w="80" w:type="dxa"/>
             </w:tcMar>
             <w:tcBorders>
-              <w:bottom w:val="single" w:sz="4" w:space="0" w:color="E5E5E5"/>
+              <w:bottom w:val="single" w:sz="8" w:space="0" w:color="909090"/>
             </w:tcBorders>
           </w:tcPr>
           <w:p>
@@ -1137,7 +1137,7 @@
               <w:right w:w="80" w:type="dxa"/>
             </w:tcMar>
             <w:tcBorders>
-              <w:bottom w:val="single" w:sz="4" w:space="0" w:color="E5E5E5"/>
+              <w:bottom w:val="single" w:sz="8" w:space="0" w:color="909090"/>
             </w:tcBorders>
           </w:tcPr>
           <w:p>
@@ -1165,7 +1165,7 @@
               <w:right w:w="80" w:type="dxa"/>
             </w:tcMar>
             <w:tcBorders>
-              <w:bottom w:val="single" w:sz="4" w:space="0" w:color="E5E5E5"/>
+              <w:bottom w:val="single" w:sz="8" w:space="0" w:color="909090"/>
             </w:tcBorders>
           </w:tcPr>
           <w:p>
@@ -1193,7 +1193,7 @@
               <w:right w:w="80" w:type="dxa"/>
             </w:tcMar>
             <w:tcBorders>
-              <w:bottom w:val="single" w:sz="4" w:space="0" w:color="E5E5E5"/>
+              <w:bottom w:val="single" w:sz="8" w:space="0" w:color="909090"/>
             </w:tcBorders>
           </w:tcPr>
           <w:p>

</xml_diff>

<commit_message>
Pack 48.4: tx header repeat + PT Sans font
</commit_message>
<xml_diff>
--- a/templates/docx/bank_statement_template_044525974.docx
+++ b/templates/docx/bank_statement_template_044525974.docx
@@ -90,7 +90,7 @@
             </w:pPr>
             <w:r>
               <w:rPr>
-                <w:rFonts w:ascii="Arial" w:hAnsi="Arial" w:cs="Arial"/>
+                <w:rFonts w:ascii="PT Sans" w:hAnsi="PT Sans" w:cs="PT Sans"/>
                 <w:b/>
                 <w:color w:val="030303"/>
                 <w:sz w:val="16"/>
@@ -105,7 +105,7 @@
             </w:pPr>
             <w:r>
               <w:rPr>
-                <w:rFonts w:ascii="Arial" w:hAnsi="Arial" w:cs="Arial"/>
+                <w:rFonts w:ascii="PT Sans" w:hAnsi="PT Sans" w:cs="PT Sans"/>
                 <w:b/>
                 <w:color w:val="030303"/>
                 <w:sz w:val="16"/>
@@ -120,7 +120,7 @@
             </w:pPr>
             <w:r>
               <w:rPr>
-                <w:rFonts w:ascii="Arial" w:hAnsi="Arial" w:cs="Arial"/>
+                <w:rFonts w:ascii="PT Sans" w:hAnsi="PT Sans" w:cs="PT Sans"/>
                 <w:b/>
                 <w:color w:val="030303"/>
                 <w:sz w:val="16"/>
@@ -142,7 +142,7 @@
       </w:pPr>
       <w:r>
         <w:rPr>
-          <w:rFonts w:ascii="Arial" w:hAnsi="Arial" w:cs="Arial"/>
+          <w:rFonts w:ascii="PT Sans" w:hAnsi="PT Sans" w:cs="PT Sans"/>
           <w:b/>
           <w:color w:val="030303"/>
           <w:sz w:val="48"/>
@@ -185,7 +185,7 @@
             </w:pPr>
             <w:r>
               <w:rPr>
-                <w:rFonts w:ascii="Arial" w:hAnsi="Arial" w:cs="Arial"/>
+                <w:rFonts w:ascii="PT Sans" w:hAnsi="PT Sans" w:cs="PT Sans"/>
                 <w:b w:val="0"/>
                 <w:color w:val="929292"/>
                 <w:sz w:val="18"/>
@@ -194,7 +194,7 @@
             </w:r>
             <w:r>
               <w:rPr>
-                <w:rFonts w:ascii="Arial" w:hAnsi="Arial" w:cs="Arial"/>
+                <w:rFonts w:ascii="PT Sans" w:hAnsi="PT Sans" w:cs="PT Sans"/>
                 <w:b w:val="0"/>
                 <w:color w:val="030303"/>
                 <w:sz w:val="18"/>
@@ -220,7 +220,7 @@
             </w:pPr>
             <w:r>
               <w:rPr>
-                <w:rFonts w:ascii="Arial" w:hAnsi="Arial" w:cs="Arial"/>
+                <w:rFonts w:ascii="PT Sans" w:hAnsi="PT Sans" w:cs="PT Sans"/>
                 <w:b w:val="0"/>
                 <w:color w:val="030303"/>
                 <w:sz w:val="18"/>
@@ -245,7 +245,7 @@
       </w:pPr>
       <w:r>
         <w:rPr>
-          <w:rFonts w:ascii="Arial" w:hAnsi="Arial" w:cs="Arial"/>
+          <w:rFonts w:ascii="PT Sans" w:hAnsi="PT Sans" w:cs="PT Sans"/>
           <w:b/>
           <w:color w:val="030303"/>
           <w:sz w:val="20"/>
@@ -270,7 +270,7 @@
       </w:pPr>
       <w:r>
         <w:rPr>
-          <w:rFonts w:ascii="Arial" w:hAnsi="Arial" w:cs="Arial"/>
+          <w:rFonts w:ascii="PT Sans" w:hAnsi="PT Sans" w:cs="PT Sans"/>
           <w:b/>
           <w:color w:val="030303"/>
           <w:sz w:val="18"/>
@@ -279,7 +279,7 @@
       </w:r>
       <w:r>
         <w:rPr>
-          <w:rFonts w:ascii="Arial" w:hAnsi="Arial" w:cs="Arial"/>
+          <w:rFonts w:ascii="PT Sans" w:hAnsi="PT Sans" w:cs="PT Sans"/>
           <w:b w:val="0"/>
           <w:color w:val="030303"/>
           <w:sz w:val="18"/>
@@ -304,7 +304,7 @@
       </w:pPr>
       <w:r>
         <w:rPr>
-          <w:rFonts w:ascii="Arial" w:hAnsi="Arial" w:cs="Arial"/>
+          <w:rFonts w:ascii="PT Sans" w:hAnsi="PT Sans" w:cs="PT Sans"/>
           <w:b/>
           <w:color w:val="030303"/>
           <w:sz w:val="18"/>
@@ -313,7 +313,7 @@
       </w:r>
       <w:r>
         <w:rPr>
-          <w:rFonts w:ascii="Arial" w:hAnsi="Arial" w:cs="Arial"/>
+          <w:rFonts w:ascii="PT Sans" w:hAnsi="PT Sans" w:cs="PT Sans"/>
           <w:b w:val="0"/>
           <w:color w:val="030303"/>
           <w:sz w:val="18"/>
@@ -374,7 +374,7 @@
             </w:pPr>
             <w:r>
               <w:rPr>
-                <w:rFonts w:ascii="Arial" w:hAnsi="Arial" w:cs="Arial"/>
+                <w:rFonts w:ascii="PT Sans" w:hAnsi="PT Sans" w:cs="PT Sans"/>
                 <w:b/>
                 <w:color w:val="030303"/>
                 <w:sz w:val="18"/>
@@ -383,7 +383,7 @@
             </w:r>
             <w:r>
               <w:rPr>
-                <w:rFonts w:ascii="Arial" w:hAnsi="Arial" w:cs="Arial"/>
+                <w:rFonts w:ascii="PT Sans" w:hAnsi="PT Sans" w:cs="PT Sans"/>
                 <w:b w:val="0"/>
                 <w:color w:val="030303"/>
                 <w:sz w:val="18"/>
@@ -408,7 +408,7 @@
             </w:pPr>
             <w:r>
               <w:rPr>
-                <w:rFonts w:ascii="Arial" w:hAnsi="Arial" w:cs="Arial"/>
+                <w:rFonts w:ascii="PT Sans" w:hAnsi="PT Sans" w:cs="PT Sans"/>
                 <w:b/>
                 <w:color w:val="030303"/>
                 <w:sz w:val="18"/>
@@ -417,7 +417,7 @@
             </w:r>
             <w:r>
               <w:rPr>
-                <w:rFonts w:ascii="Arial" w:hAnsi="Arial" w:cs="Arial"/>
+                <w:rFonts w:ascii="PT Sans" w:hAnsi="PT Sans" w:cs="PT Sans"/>
                 <w:b w:val="0"/>
                 <w:color w:val="030303"/>
                 <w:sz w:val="18"/>
@@ -442,7 +442,7 @@
             </w:pPr>
             <w:r>
               <w:rPr>
-                <w:rFonts w:ascii="Arial" w:hAnsi="Arial" w:cs="Arial"/>
+                <w:rFonts w:ascii="PT Sans" w:hAnsi="PT Sans" w:cs="PT Sans"/>
                 <w:b/>
                 <w:color w:val="030303"/>
                 <w:sz w:val="18"/>
@@ -451,7 +451,7 @@
             </w:r>
             <w:r>
               <w:rPr>
-                <w:rFonts w:ascii="Arial" w:hAnsi="Arial" w:cs="Arial"/>
+                <w:rFonts w:ascii="PT Sans" w:hAnsi="PT Sans" w:cs="PT Sans"/>
                 <w:b w:val="0"/>
                 <w:color w:val="030303"/>
                 <w:sz w:val="18"/>
@@ -476,7 +476,7 @@
             </w:pPr>
             <w:r>
               <w:rPr>
-                <w:rFonts w:ascii="Arial" w:hAnsi="Arial" w:cs="Arial"/>
+                <w:rFonts w:ascii="PT Sans" w:hAnsi="PT Sans" w:cs="PT Sans"/>
                 <w:b/>
                 <w:color w:val="030303"/>
                 <w:sz w:val="18"/>
@@ -485,7 +485,7 @@
             </w:r>
             <w:r>
               <w:rPr>
-                <w:rFonts w:ascii="Arial" w:hAnsi="Arial" w:cs="Arial"/>
+                <w:rFonts w:ascii="PT Sans" w:hAnsi="PT Sans" w:cs="PT Sans"/>
                 <w:b w:val="0"/>
                 <w:color w:val="030303"/>
                 <w:sz w:val="18"/>
@@ -513,7 +513,7 @@
       </w:pPr>
       <w:r>
         <w:rPr>
-          <w:rFonts w:ascii="Arial" w:hAnsi="Arial" w:cs="Arial"/>
+          <w:rFonts w:ascii="PT Sans" w:hAnsi="PT Sans" w:cs="PT Sans"/>
           <w:b/>
           <w:color w:val="030303"/>
           <w:sz w:val="18"/>
@@ -522,7 +522,7 @@
       </w:r>
       <w:r>
         <w:rPr>
-          <w:rFonts w:ascii="Arial" w:hAnsi="Arial" w:cs="Arial"/>
+          <w:rFonts w:ascii="PT Sans" w:hAnsi="PT Sans" w:cs="PT Sans"/>
           <w:b w:val="0"/>
           <w:color w:val="030303"/>
           <w:sz w:val="18"/>
@@ -531,7 +531,7 @@
       </w:r>
       <w:r>
         <w:rPr>
-          <w:rFonts w:ascii="Arial" w:hAnsi="Arial" w:cs="Arial"/>
+          <w:rFonts w:ascii="PT Sans" w:hAnsi="PT Sans" w:cs="PT Sans"/>
           <w:b/>
           <w:color w:val="030303"/>
           <w:sz w:val="18"/>
@@ -540,7 +540,7 @@
       </w:r>
       <w:r>
         <w:rPr>
-          <w:rFonts w:ascii="Arial" w:hAnsi="Arial" w:cs="Arial"/>
+          <w:rFonts w:ascii="PT Sans" w:hAnsi="PT Sans" w:cs="PT Sans"/>
           <w:b w:val="0"/>
           <w:color w:val="030303"/>
           <w:sz w:val="18"/>
@@ -565,7 +565,7 @@
       </w:pPr>
       <w:r>
         <w:rPr>
-          <w:rFonts w:ascii="Arial" w:hAnsi="Arial" w:cs="Arial"/>
+          <w:rFonts w:ascii="PT Sans" w:hAnsi="PT Sans" w:cs="PT Sans"/>
           <w:b/>
           <w:color w:val="030303"/>
           <w:sz w:val="18"/>
@@ -574,7 +574,7 @@
       </w:r>
       <w:r>
         <w:rPr>
-          <w:rFonts w:ascii="Arial" w:hAnsi="Arial" w:cs="Arial"/>
+          <w:rFonts w:ascii="PT Sans" w:hAnsi="PT Sans" w:cs="PT Sans"/>
           <w:b w:val="0"/>
           <w:color w:val="030303"/>
           <w:sz w:val="18"/>
@@ -599,7 +599,7 @@
       </w:pPr>
       <w:r>
         <w:rPr>
-          <w:rFonts w:ascii="Arial" w:hAnsi="Arial" w:cs="Arial"/>
+          <w:rFonts w:ascii="PT Sans" w:hAnsi="PT Sans" w:cs="PT Sans"/>
           <w:b/>
           <w:color w:val="030303"/>
           <w:sz w:val="18"/>
@@ -608,7 +608,7 @@
       </w:r>
       <w:r>
         <w:rPr>
-          <w:rFonts w:ascii="Arial" w:hAnsi="Arial" w:cs="Arial"/>
+          <w:rFonts w:ascii="PT Sans" w:hAnsi="PT Sans" w:cs="PT Sans"/>
           <w:b w:val="0"/>
           <w:color w:val="030303"/>
           <w:sz w:val="18"/>
@@ -635,7 +635,7 @@
       </w:pPr>
       <w:r>
         <w:rPr>
-          <w:rFonts w:ascii="Arial" w:hAnsi="Arial" w:cs="Arial"/>
+          <w:rFonts w:ascii="PT Sans" w:hAnsi="PT Sans" w:cs="PT Sans"/>
           <w:b w:val="0"/>
           <w:color w:val="030303"/>
           <w:sz w:val="28"/>
@@ -652,7 +652,7 @@
       </w:pPr>
       <w:r>
         <w:rPr>
-          <w:rFonts w:ascii="Arial" w:hAnsi="Arial" w:cs="Arial"/>
+          <w:rFonts w:ascii="PT Sans" w:hAnsi="PT Sans" w:cs="PT Sans"/>
           <w:b/>
           <w:color w:val="030303"/>
           <w:sz w:val="18"/>
@@ -661,7 +661,7 @@
       </w:r>
       <w:r>
         <w:rPr>
-          <w:rFonts w:ascii="Arial" w:hAnsi="Arial" w:cs="Arial"/>
+          <w:rFonts w:ascii="PT Sans" w:hAnsi="PT Sans" w:cs="PT Sans"/>
           <w:b w:val="0"/>
           <w:color w:val="030303"/>
           <w:sz w:val="18"/>
@@ -678,7 +678,7 @@
       </w:pPr>
       <w:r>
         <w:rPr>
-          <w:rFonts w:ascii="Arial" w:hAnsi="Arial" w:cs="Arial"/>
+          <w:rFonts w:ascii="PT Sans" w:hAnsi="PT Sans" w:cs="PT Sans"/>
           <w:b/>
           <w:color w:val="030303"/>
           <w:sz w:val="18"/>
@@ -687,7 +687,7 @@
       </w:r>
       <w:r>
         <w:rPr>
-          <w:rFonts w:ascii="Arial" w:hAnsi="Arial" w:cs="Arial"/>
+          <w:rFonts w:ascii="PT Sans" w:hAnsi="PT Sans" w:cs="PT Sans"/>
           <w:b w:val="0"/>
           <w:color w:val="030303"/>
           <w:sz w:val="18"/>
@@ -704,7 +704,7 @@
       </w:pPr>
       <w:r>
         <w:rPr>
-          <w:rFonts w:ascii="Arial" w:hAnsi="Arial" w:cs="Arial"/>
+          <w:rFonts w:ascii="PT Sans" w:hAnsi="PT Sans" w:cs="PT Sans"/>
           <w:b/>
           <w:color w:val="030303"/>
           <w:sz w:val="18"/>
@@ -713,7 +713,7 @@
       </w:r>
       <w:r>
         <w:rPr>
-          <w:rFonts w:ascii="Arial" w:hAnsi="Arial" w:cs="Arial"/>
+          <w:rFonts w:ascii="PT Sans" w:hAnsi="PT Sans" w:cs="PT Sans"/>
           <w:b w:val="0"/>
           <w:color w:val="030303"/>
           <w:sz w:val="18"/>
@@ -730,7 +730,7 @@
       </w:pPr>
       <w:r>
         <w:rPr>
-          <w:rFonts w:ascii="Arial" w:hAnsi="Arial" w:cs="Arial"/>
+          <w:rFonts w:ascii="PT Sans" w:hAnsi="PT Sans" w:cs="PT Sans"/>
           <w:b/>
           <w:color w:val="030303"/>
           <w:sz w:val="18"/>
@@ -739,7 +739,7 @@
       </w:r>
       <w:r>
         <w:rPr>
-          <w:rFonts w:ascii="Arial" w:hAnsi="Arial" w:cs="Arial"/>
+          <w:rFonts w:ascii="PT Sans" w:hAnsi="PT Sans" w:cs="PT Sans"/>
           <w:b w:val="0"/>
           <w:color w:val="030303"/>
           <w:sz w:val="18"/>
@@ -758,7 +758,7 @@
       </w:pPr>
       <w:r>
         <w:rPr>
-          <w:rFonts w:ascii="Arial" w:hAnsi="Arial" w:cs="Arial"/>
+          <w:rFonts w:ascii="PT Sans" w:hAnsi="PT Sans" w:cs="PT Sans"/>
           <w:b w:val="0"/>
           <w:color w:val="030303"/>
           <w:sz w:val="28"/>
@@ -789,6 +789,9 @@
         <w:gridCol w:w="1134"/>
       </w:tblGrid>
       <w:tr>
+        <w:trPr>
+          <w:tblHeader/>
+        </w:trPr>
         <w:tc>
           <w:tcPr>
             <w:tcW w:type="dxa" w:w="1417"/>
@@ -808,7 +811,7 @@
             </w:pPr>
             <w:r>
               <w:rPr>
-                <w:rFonts w:ascii="Arial" w:hAnsi="Arial" w:cs="Arial"/>
+                <w:rFonts w:ascii="PT Sans" w:hAnsi="PT Sans" w:cs="PT Sans"/>
                 <w:b w:val="0"/>
                 <w:color w:val="929292"/>
                 <w:sz w:val="16"/>
@@ -822,7 +825,7 @@
             </w:pPr>
             <w:r>
               <w:rPr>
-                <w:rFonts w:ascii="Arial" w:hAnsi="Arial" w:cs="Arial"/>
+                <w:rFonts w:ascii="PT Sans" w:hAnsi="PT Sans" w:cs="PT Sans"/>
                 <w:b w:val="0"/>
                 <w:color w:val="929292"/>
                 <w:sz w:val="16"/>
@@ -850,7 +853,7 @@
             </w:pPr>
             <w:r>
               <w:rPr>
-                <w:rFonts w:ascii="Arial" w:hAnsi="Arial" w:cs="Arial"/>
+                <w:rFonts w:ascii="PT Sans" w:hAnsi="PT Sans" w:cs="PT Sans"/>
                 <w:b w:val="0"/>
                 <w:color w:val="929292"/>
                 <w:sz w:val="16"/>
@@ -864,7 +867,7 @@
             </w:pPr>
             <w:r>
               <w:rPr>
-                <w:rFonts w:ascii="Arial" w:hAnsi="Arial" w:cs="Arial"/>
+                <w:rFonts w:ascii="PT Sans" w:hAnsi="PT Sans" w:cs="PT Sans"/>
                 <w:b w:val="0"/>
                 <w:color w:val="929292"/>
                 <w:sz w:val="16"/>
@@ -892,7 +895,7 @@
             </w:pPr>
             <w:r>
               <w:rPr>
-                <w:rFonts w:ascii="Arial" w:hAnsi="Arial" w:cs="Arial"/>
+                <w:rFonts w:ascii="PT Sans" w:hAnsi="PT Sans" w:cs="PT Sans"/>
                 <w:b w:val="0"/>
                 <w:color w:val="929292"/>
                 <w:sz w:val="16"/>
@@ -906,7 +909,7 @@
             </w:pPr>
             <w:r>
               <w:rPr>
-                <w:rFonts w:ascii="Arial" w:hAnsi="Arial" w:cs="Arial"/>
+                <w:rFonts w:ascii="PT Sans" w:hAnsi="PT Sans" w:cs="PT Sans"/>
                 <w:b w:val="0"/>
                 <w:color w:val="929292"/>
                 <w:sz w:val="16"/>
@@ -934,7 +937,7 @@
             </w:pPr>
             <w:r>
               <w:rPr>
-                <w:rFonts w:ascii="Arial" w:hAnsi="Arial" w:cs="Arial"/>
+                <w:rFonts w:ascii="PT Sans" w:hAnsi="PT Sans" w:cs="PT Sans"/>
                 <w:b w:val="0"/>
                 <w:color w:val="929292"/>
                 <w:sz w:val="16"/>
@@ -948,7 +951,7 @@
             </w:pPr>
             <w:r>
               <w:rPr>
-                <w:rFonts w:ascii="Arial" w:hAnsi="Arial" w:cs="Arial"/>
+                <w:rFonts w:ascii="PT Sans" w:hAnsi="PT Sans" w:cs="PT Sans"/>
                 <w:b w:val="0"/>
                 <w:color w:val="929292"/>
                 <w:sz w:val="16"/>
@@ -976,7 +979,7 @@
             </w:pPr>
             <w:r>
               <w:rPr>
-                <w:rFonts w:ascii="Arial" w:hAnsi="Arial" w:cs="Arial"/>
+                <w:rFonts w:ascii="PT Sans" w:hAnsi="PT Sans" w:cs="PT Sans"/>
                 <w:b w:val="0"/>
                 <w:color w:val="929292"/>
                 <w:sz w:val="16"/>
@@ -990,7 +993,7 @@
             </w:pPr>
             <w:r>
               <w:rPr>
-                <w:rFonts w:ascii="Arial" w:hAnsi="Arial" w:cs="Arial"/>
+                <w:rFonts w:ascii="PT Sans" w:hAnsi="PT Sans" w:cs="PT Sans"/>
                 <w:b w:val="0"/>
                 <w:color w:val="929292"/>
                 <w:sz w:val="16"/>
@@ -1018,7 +1021,7 @@
             </w:pPr>
             <w:r>
               <w:rPr>
-                <w:rFonts w:ascii="Arial" w:hAnsi="Arial" w:cs="Arial"/>
+                <w:rFonts w:ascii="PT Sans" w:hAnsi="PT Sans" w:cs="PT Sans"/>
                 <w:b w:val="0"/>
                 <w:color w:val="929292"/>
                 <w:sz w:val="16"/>
@@ -1032,7 +1035,7 @@
             </w:pPr>
             <w:r>
               <w:rPr>
-                <w:rFonts w:ascii="Arial" w:hAnsi="Arial" w:cs="Arial"/>
+                <w:rFonts w:ascii="PT Sans" w:hAnsi="PT Sans" w:cs="PT Sans"/>
                 <w:b w:val="0"/>
                 <w:color w:val="929292"/>
                 <w:sz w:val="16"/>
@@ -1062,7 +1065,7 @@
             </w:pPr>
             <w:r>
               <w:rPr>
-                <w:rFonts w:ascii="Arial" w:hAnsi="Arial" w:cs="Arial"/>
+                <w:rFonts w:ascii="PT Sans" w:hAnsi="PT Sans" w:cs="PT Sans"/>
                 <w:b w:val="0"/>
                 <w:color w:val="030303"/>
                 <w:sz w:val="18"/>
@@ -1090,7 +1093,7 @@
             </w:pPr>
             <w:r>
               <w:rPr>
-                <w:rFonts w:ascii="Arial" w:hAnsi="Arial" w:cs="Arial"/>
+                <w:rFonts w:ascii="PT Sans" w:hAnsi="PT Sans" w:cs="PT Sans"/>
                 <w:b w:val="0"/>
                 <w:color w:val="030303"/>
                 <w:sz w:val="18"/>
@@ -1118,7 +1121,7 @@
             </w:pPr>
             <w:r>
               <w:rPr>
-                <w:rFonts w:ascii="Arial" w:hAnsi="Arial" w:cs="Arial"/>
+                <w:rFonts w:ascii="PT Sans" w:hAnsi="PT Sans" w:cs="PT Sans"/>
                 <w:b w:val="0"/>
                 <w:color w:val="030303"/>
                 <w:sz w:val="18"/>
@@ -1146,7 +1149,7 @@
             </w:pPr>
             <w:r>
               <w:rPr>
-                <w:rFonts w:ascii="Arial" w:hAnsi="Arial" w:cs="Arial"/>
+                <w:rFonts w:ascii="PT Sans" w:hAnsi="PT Sans" w:cs="PT Sans"/>
                 <w:b w:val="0"/>
                 <w:color w:val="030303"/>
                 <w:sz w:val="18"/>
@@ -1174,7 +1177,7 @@
             </w:pPr>
             <w:r>
               <w:rPr>
-                <w:rFonts w:ascii="Arial" w:hAnsi="Arial" w:cs="Arial"/>
+                <w:rFonts w:ascii="PT Sans" w:hAnsi="PT Sans" w:cs="PT Sans"/>
                 <w:b w:val="0"/>
                 <w:color w:val="030303"/>
                 <w:sz w:val="18"/>
@@ -1202,7 +1205,7 @@
             </w:pPr>
             <w:r>
               <w:rPr>
-                <w:rFonts w:ascii="Arial" w:hAnsi="Arial" w:cs="Arial"/>
+                <w:rFonts w:ascii="PT Sans" w:hAnsi="PT Sans" w:cs="PT Sans"/>
                 <w:b w:val="0"/>
                 <w:color w:val="030303"/>
                 <w:sz w:val="18"/>
@@ -1253,7 +1256,7 @@
             </w:pPr>
             <w:r>
               <w:rPr>
-                <w:rFonts w:ascii="Arial" w:hAnsi="Arial" w:cs="Arial"/>
+                <w:rFonts w:ascii="PT Sans" w:hAnsi="PT Sans" w:cs="PT Sans"/>
                 <w:b w:val="0"/>
                 <w:color w:val="030303"/>
                 <w:sz w:val="18"/>
@@ -1278,7 +1281,7 @@
             </w:pPr>
             <w:r>
               <w:rPr>
-                <w:rFonts w:ascii="Arial" w:hAnsi="Arial" w:cs="Arial"/>
+                <w:rFonts w:ascii="PT Sans" w:hAnsi="PT Sans" w:cs="PT Sans"/>
                 <w:b w:val="0"/>
                 <w:color w:val="030303"/>
                 <w:sz w:val="18"/>
@@ -1305,7 +1308,7 @@
             </w:pPr>
             <w:r>
               <w:rPr>
-                <w:rFonts w:ascii="Arial" w:hAnsi="Arial" w:cs="Arial"/>
+                <w:rFonts w:ascii="PT Sans" w:hAnsi="PT Sans" w:cs="PT Sans"/>
                 <w:b w:val="0"/>
                 <w:color w:val="030303"/>
                 <w:sz w:val="18"/>
@@ -1330,7 +1333,7 @@
             </w:pPr>
             <w:r>
               <w:rPr>
-                <w:rFonts w:ascii="Arial" w:hAnsi="Arial" w:cs="Arial"/>
+                <w:rFonts w:ascii="PT Sans" w:hAnsi="PT Sans" w:cs="PT Sans"/>
                 <w:b w:val="0"/>
                 <w:color w:val="030303"/>
                 <w:sz w:val="18"/>
@@ -1813,7 +1816,7 @@
     <w:qFormat/>
     <w:rsid w:val="00FC693F"/>
     <w:rPr>
-      <w:rFonts w:ascii="Arial" w:hAnsi="Arial"/>
+      <w:rFonts w:ascii="PT Sans" w:hAnsi="PT Sans"/>
       <w:color w:val="030303"/>
       <w:sz w:val="18"/>
     </w:rPr>

</xml_diff>